<commit_message>
Corrige puntos 1 y 2 con el diagnóstico 2026: plan vigente 2013, postgrado, población estudiantil y turnos
Co-Authored-By: Claude Opus 5.5 <noreply@anthropic.com>
Claude-Session: https://claude.ai/code/session_01Li7yxA95TVg4oPXuqG5DZe
</commit_message>
<xml_diff>
--- a/rediseno_2026/1. Identificación del programa-carrera.docx
+++ b/rediseno_2026/1. Identificación del programa-carrera.docx
@@ -760,9 +760,9 @@
         <w:tblLook w:firstColumn="1" w:firstRow="1" w:lastColumn="0" w:lastRow="0" w:noHBand="0" w:noVBand="1" w:val="04A0"/>
       </w:tblPr>
       <w:tblGrid>
+        <w:gridCol w:w="2154"/>
+        <w:gridCol w:w="4365"/>
         <w:gridCol w:w="2551"/>
-        <w:gridCol w:w="3685"/>
-        <w:gridCol w:w="2835"/>
       </w:tblGrid>
       <w:tr>
         <w:trPr>
@@ -770,7 +770,7 @@
         </w:trPr>
         <w:tc>
           <w:tcPr>
-            <w:tcW w:type="dxa" w:w="2551"/>
+            <w:tcW w:type="dxa" w:w="2154"/>
             <w:tcBorders>
               <w:top w:val="single" w:sz="4" w:space="0" w:color="4472C4"/>
               <w:left w:val="single" w:sz="4" w:space="0" w:color="4472C4"/>
@@ -799,7 +799,7 @@
         </w:tc>
         <w:tc>
           <w:tcPr>
-            <w:tcW w:type="dxa" w:w="3685"/>
+            <w:tcW w:type="dxa" w:w="4365"/>
             <w:tcBorders>
               <w:top w:val="single" w:sz="4" w:space="0" w:color="4472C4"/>
               <w:left w:val="single" w:sz="4" w:space="0" w:color="4472C4"/>
@@ -822,13 +822,13 @@
                 <w:color w:val="FFFFFF"/>
                 <w:sz w:val="20"/>
               </w:rPr>
-              <w:t>Resolución de aprobación</w:t>
+              <w:t>Resoluciones de aprobación</w:t>
             </w:r>
           </w:p>
         </w:tc>
         <w:tc>
           <w:tcPr>
-            <w:tcW w:type="dxa" w:w="2835"/>
+            <w:tcW w:type="dxa" w:w="2551"/>
             <w:tcBorders>
               <w:top w:val="single" w:sz="4" w:space="0" w:color="4472C4"/>
               <w:left w:val="single" w:sz="4" w:space="0" w:color="4472C4"/>
@@ -851,7 +851,7 @@
                 <w:color w:val="FFFFFF"/>
                 <w:sz w:val="20"/>
               </w:rPr>
-              <w:t>Fecha</w:t>
+              <w:t>Fecha de la Resolución HCU</w:t>
             </w:r>
           </w:p>
         </w:tc>
@@ -859,7 +859,7 @@
       <w:tr>
         <w:tc>
           <w:tcPr>
-            <w:tcW w:type="dxa" w:w="2551"/>
+            <w:tcW w:type="dxa" w:w="2154"/>
             <w:tcBorders>
               <w:top w:val="single" w:sz="4" w:space="0" w:color="8EAADB"/>
               <w:left w:val="single" w:sz="4" w:space="0" w:color="8EAADB"/>
@@ -887,7 +887,7 @@
         </w:tc>
         <w:tc>
           <w:tcPr>
-            <w:tcW w:type="dxa" w:w="3685"/>
+            <w:tcW w:type="dxa" w:w="4365"/>
             <w:tcBorders>
               <w:top w:val="single" w:sz="4" w:space="0" w:color="8EAADB"/>
               <w:left w:val="single" w:sz="4" w:space="0" w:color="8EAADB"/>
@@ -915,7 +915,7 @@
         </w:tc>
         <w:tc>
           <w:tcPr>
-            <w:tcW w:type="dxa" w:w="2835"/>
+            <w:tcW w:type="dxa" w:w="2551"/>
             <w:tcBorders>
               <w:top w:val="single" w:sz="4" w:space="0" w:color="8EAADB"/>
               <w:left w:val="single" w:sz="4" w:space="0" w:color="8EAADB"/>
@@ -945,7 +945,7 @@
       <w:tr>
         <w:tc>
           <w:tcPr>
-            <w:tcW w:type="dxa" w:w="2551"/>
+            <w:tcW w:type="dxa" w:w="2154"/>
             <w:tcBorders>
               <w:top w:val="single" w:sz="4" w:space="0" w:color="8EAADB"/>
               <w:left w:val="single" w:sz="4" w:space="0" w:color="8EAADB"/>
@@ -973,7 +973,7 @@
         </w:tc>
         <w:tc>
           <w:tcPr>
-            <w:tcW w:type="dxa" w:w="3685"/>
+            <w:tcW w:type="dxa" w:w="4365"/>
             <w:tcBorders>
               <w:top w:val="single" w:sz="4" w:space="0" w:color="8EAADB"/>
               <w:left w:val="single" w:sz="4" w:space="0" w:color="8EAADB"/>
@@ -995,13 +995,13 @@
                 <w:i w:val="0"/>
                 <w:sz w:val="20"/>
               </w:rPr>
-              <w:t>Resolución HCU N.º 025/2013</w:t>
+              <w:t>Resoluciones HCC N.º 162/2012, HCF N.º 929/2012 y HCU N.º 025/2013</w:t>
             </w:r>
           </w:p>
         </w:tc>
         <w:tc>
           <w:tcPr>
-            <w:tcW w:type="dxa" w:w="2835"/>
+            <w:tcW w:type="dxa" w:w="2551"/>
             <w:tcBorders>
               <w:top w:val="single" w:sz="4" w:space="0" w:color="8EAADB"/>
               <w:left w:val="single" w:sz="4" w:space="0" w:color="8EAADB"/>
@@ -1031,7 +1031,7 @@
       <w:tr>
         <w:tc>
           <w:tcPr>
-            <w:tcW w:type="dxa" w:w="2551"/>
+            <w:tcW w:type="dxa" w:w="2154"/>
             <w:tcBorders>
               <w:top w:val="single" w:sz="4" w:space="0" w:color="8EAADB"/>
               <w:left w:val="single" w:sz="4" w:space="0" w:color="8EAADB"/>
@@ -1059,7 +1059,7 @@
         </w:tc>
         <w:tc>
           <w:tcPr>
-            <w:tcW w:type="dxa" w:w="3685"/>
+            <w:tcW w:type="dxa" w:w="4365"/>
             <w:tcBorders>
               <w:top w:val="single" w:sz="4" w:space="0" w:color="8EAADB"/>
               <w:left w:val="single" w:sz="4" w:space="0" w:color="8EAADB"/>
@@ -1088,7 +1088,7 @@
         </w:tc>
         <w:tc>
           <w:tcPr>
-            <w:tcW w:type="dxa" w:w="2835"/>
+            <w:tcW w:type="dxa" w:w="2551"/>
             <w:tcBorders>
               <w:top w:val="single" w:sz="4" w:space="0" w:color="8EAADB"/>
               <w:left w:val="single" w:sz="4" w:space="0" w:color="8EAADB"/>
@@ -1135,7 +1135,7 @@
           <w:i w:val="0"/>
           <w:sz w:val="20"/>
         </w:rPr>
-        <w:t>El Plan de Estudios 1999 fue aprobado en el II Congreso Interno de la Carrera de Auditoría y ratificado por el Honorable Consejo Universitario mediante la Resolución N.º 524/2004. El Plan de Estudios 2024 es el que se encuentra vigente y constituye el punto de partida del presente rediseño curricular.</w:t>
+        <w:t>El Plan de Estudios 1999 fue aprobado en el II Congreso Interno de la Carrera de Auditoría y ratificado por el Honorable Consejo Universitario mediante la Resolución N.º 524/2004. El Plan de Estudios 2013 es el plan vigente: acumula más de doce años de aplicación y es el objeto del Diagnóstico de la Carrera que sustenta el presente rediseño curricular.</w:t>
       </w:r>
     </w:p>
     <w:p>
@@ -1195,7 +1195,7 @@
           <w:i w:val="0"/>
           <w:sz w:val="20"/>
         </w:rPr>
-        <w:t>Concluidos los cinco años de formación académica, acreditados con el certificado de egreso, y aprobada una de las modalidades de graduación vigentes, el estudiante accede al grado académico de Licenciatura en Contaduría Pública.</w:t>
+        <w:t>Concluidos los cinco años de formación académica, con una carga de 6.000 horas académicas, acreditados con el certificado de egreso, y aprobada una de las modalidades de graduación vigentes, el estudiante accede al grado académico de Licenciatura en Contaduría Pública.</w:t>
       </w:r>
     </w:p>
     <w:p>
@@ -1255,7 +1255,7 @@
           <w:i w:val="0"/>
           <w:sz w:val="20"/>
         </w:rPr>
-        <w:t>El Plan de Estudios 2024 reconoce además el grado de Técnico Medio, con la denominación de Auxiliar en Contabilidad General, al concluir el segundo año de formación académica.</w:t>
+        <w:t>Al concluir el segundo año de formación académica, el estudiante puede acceder además al grado de Técnico Medio, con la denominación de Auxiliar en Contabilidad General.</w:t>
       </w:r>
     </w:p>
     <w:p>
@@ -1697,7 +1697,7 @@
           <w:i w:val="0"/>
           <w:sz w:val="20"/>
         </w:rPr>
-        <w:t xml:space="preserve"> ciudad de La Paz, en predios de la Facultad de Ciencias Económicas y Financieras de la Universidad Mayor de San Andrés.</w:t>
+        <w:t xml:space="preserve"> ciudad de La Paz. Las actividades académicas se desarrollan en el Edificio Nava Morales, ubicado en la avenida Montes esquina Pando, y en el Edificio Monoblock Central de la Universidad, en la avenida Villazón.</w:t>
       </w:r>
     </w:p>
     <w:p>
@@ -1725,7 +1725,7 @@
           <w:i w:val="0"/>
           <w:sz w:val="20"/>
         </w:rPr>
-        <w:t xml:space="preserve"> Centro Regional Universitario Yungas, en Chulumani, y Sede Universitaria Local Caranavi.</w:t>
+        <w:t xml:space="preserve"> Centro Regional Universitario Yungas, en Chulumani, y Sede Universitaria Local Caranavi. En la gestión 2025 estas sedes registraron 104 estudiantes inscritos.</w:t>
       </w:r>
     </w:p>
     <w:p>
@@ -1950,7 +1950,7 @@
           <w:i w:val="0"/>
           <w:sz w:val="20"/>
         </w:rPr>
-        <w:t>La Carrera desarrolla sus actividades académicas en modalidad presencial, bajo régimen anual. Las plataformas virtuales de la Universidad se emplean como apoyo al proceso de enseñanza y aprendizaje, sin sustituir las horas presenciales previstas en el plan de estudios.</w:t>
+        <w:t>La Carrera desarrolla sus actividades académicas en modalidad presencial, bajo régimen anual, en dos turnos: diurno y nocturno. El turno nocturno se implementó para atender a los estudiantes que realizan actividad laboral. La Carrera cuenta además con una plataforma virtual que refuerza el aprendizaje en aula y permite la recepción de tareas, controles de lectura y otras evaluaciones en línea, sin sustituir las horas presenciales previstas en el plan de estudios.</w:t>
       </w:r>
     </w:p>
     <w:p>

</xml_diff>

<commit_message>
Corrige puntos 1, 2, 4.3, 5 y 13 con documentos pilares
Alinea el punto 5 al Reglamento del Régimen Académico Estudiantil del
Sistema de la Universidad Boliviana (admisión, derechos y obligaciones,
régimen académico, evaluación y modalidades de graduación), incorpora el
Técnico Universitario Medio según la Resolución HCU 426/2024 y cita el
organigrama y los reglamentos internos aprobados por la Resolución HCU
139/2013. Deja como observación para la comisión el examen de grado
técnico superior y el número de asignaturas del Técnico Universitario Medio.

Co-Authored-By: Claude Opus 5.5 <noreply@anthropic.com>
Claude-Session: https://claude.ai/code/session_01Li7yxA95TVg4oPXuqG5DZe
</commit_message>
<xml_diff>
--- a/rediseno_2026/1. Identificación del programa-carrera.docx
+++ b/rediseno_2026/1. Identificación del programa-carrera.docx
@@ -1255,7 +1255,7 @@
           <w:i w:val="0"/>
           <w:sz w:val="20"/>
         </w:rPr>
-        <w:t>Al concluir el segundo año de formación académica, el estudiante puede acceder además al grado de Técnico Medio, con la denominación de Auxiliar en Contabilidad General.</w:t>
+        <w:t>Al concluir el segundo año de formación académica, el estudiante puede acceder además al grado de Técnico Universitario Medio, con la denominación de Auxiliar en Contabilidad General. La Resolución del Honorable Consejo Universitario N.º 426/2024, de 24 de julio de 2024, incluye este grado en el Cuadro General de Grados de la UMSA y establece como requisito ineludible la aprobación de todas las materias de primero y segundo año en el tiempo determinado de dos años; su modalidad de graduación es directa.</w:t>
       </w:r>
     </w:p>
     <w:p>
@@ -1270,7 +1270,7 @@
           <w:i w:val="0"/>
           <w:sz w:val="20"/>
         </w:rPr>
-        <w:t>Ambos grados se encuentran tipificados en el Artículo 4 del Reglamento General de Títulos y Grados aprobado en el XII Congreso Nacional de Universidades.</w:t>
+        <w:t>Ambos grados se encuentran tipificados en el Artículo 4 del Reglamento General de Títulos y Grados aprobado en el XII Congreso Nacional de Universidades, y sus modalidades de graduación, en el Artículo 66 del Reglamento del Régimen Académico Estudiantil del Sistema de la Universidad Boliviana.</w:t>
       </w:r>
     </w:p>
     <w:tbl>
@@ -1372,7 +1372,7 @@
                 <w:color w:val="FFFFFF"/>
                 <w:sz w:val="20"/>
               </w:rPr>
-              <w:t>Título en provisión nacional</w:t>
+              <w:t>Título</w:t>
             </w:r>
           </w:p>
         </w:tc>
@@ -1430,7 +1430,7 @@
                 <w:i w:val="0"/>
                 <w:sz w:val="20"/>
               </w:rPr>
-              <w:t>Técnico Medio, Auxiliar en Contabilidad General</w:t>
+              <w:t>Técnico Universitario Medio, Auxiliar en Contabilidad General</w:t>
             </w:r>
           </w:p>
         </w:tc>
@@ -1458,7 +1458,7 @@
                 <w:i w:val="0"/>
                 <w:sz w:val="20"/>
               </w:rPr>
-              <w:t>No corresponde</w:t>
+              <w:t>Título profesional de Técnico Universitario Medio</w:t>
             </w:r>
           </w:p>
         </w:tc>
@@ -1544,7 +1544,7 @@
                 <w:i w:val="0"/>
                 <w:sz w:val="20"/>
               </w:rPr>
-              <w:t>Contador General</w:t>
+              <w:t>Título en provisión nacional de Contador General</w:t>
             </w:r>
           </w:p>
         </w:tc>
@@ -1630,7 +1630,7 @@
                 <w:i w:val="0"/>
                 <w:sz w:val="20"/>
               </w:rPr>
-              <w:t>Contador Público Autorizado</w:t>
+              <w:t>Título en provisión nacional de Contador Público Autorizado</w:t>
             </w:r>
           </w:p>
         </w:tc>
@@ -1815,6 +1815,21 @@
           <w:i w:val="0"/>
           <w:sz w:val="20"/>
         </w:rPr>
+        <w:t>Técnico Universitario Medio, conforme a la Resolución del Honorable Consejo Universitario N.º 426/2024.</w:t>
+      </w:r>
+    </w:p>
+    <w:p>
+      <w:pPr>
+        <w:spacing w:before="0" w:after="200" w:line="240" w:lineRule="auto"/>
+        <w:jc w:val="both"/>
+      </w:pPr>
+      <w:r>
+        <w:rPr>
+          <w:rFonts w:ascii="Century Gothic" w:hAnsi="Century Gothic" w:cs="Century Gothic" w:eastAsia="Century Gothic"/>
+          <w:b w:val="0"/>
+          <w:i w:val="0"/>
+          <w:sz w:val="20"/>
+        </w:rPr>
         <w:t>Técnico Universitario Superior en Contabilidad General, conforme a la Resolución del Honorable Consejo Universitario N.º 290/2016.</w:t>
       </w:r>
     </w:p>
@@ -1891,6 +1906,21 @@
           <w:sz w:val="24"/>
         </w:rPr>
         <w:t>Título(s) profesional(es) intermedio(s)</w:t>
+      </w:r>
+    </w:p>
+    <w:p>
+      <w:pPr>
+        <w:spacing w:before="0" w:after="200" w:line="240" w:lineRule="auto"/>
+        <w:jc w:val="both"/>
+      </w:pPr>
+      <w:r>
+        <w:rPr>
+          <w:rFonts w:ascii="Century Gothic" w:hAnsi="Century Gothic" w:cs="Century Gothic" w:eastAsia="Century Gothic"/>
+          <w:b w:val="0"/>
+          <w:i w:val="0"/>
+          <w:sz w:val="20"/>
+        </w:rPr>
+        <w:t>Título profesional de Técnico Universitario Medio, conforme al Artículo Segundo de la Resolución del Honorable Consejo Universitario N.º 426/2024.</w:t>
       </w:r>
     </w:p>
     <w:p>

</xml_diff>

<commit_message>
Integra la revisión de la comisión en los puntos 1, 2, 3, 5, 6 y 7
Toma como base las versiones revisadas por la comisión y les aplica las
correcciones con los documentos pilares: Reglamento del Régimen Académico
Estudiantil y Resoluciones HCU 426/2024, 139/2013 y 032/2025. Propaga los
cambios a los puntos 4.3, 4.7, 8, 12 y 13. El punto 2.3 y las menciones al
PEI quedan en amarillo, pendientes del PEI 2026-2030.

Co-Authored-By: Claude Opus 5.5 <noreply@anthropic.com>
Claude-Session: https://claude.ai/code/session_01Li7yxA95TVg4oPXuqG5DZe
</commit_message>
<xml_diff>
--- a/rediseno_2026/1. Identificación del programa-carrera.docx
+++ b/rediseno_2026/1. Identificación del programa-carrera.docx
@@ -302,7 +302,7 @@
           <w:p>
             <w:pPr>
               <w:spacing w:before="0" w:after="0" w:line="240" w:lineRule="auto"/>
-              <w:jc w:val="left"/>
+              <w:jc w:val="both"/>
             </w:pPr>
             <w:r>
               <w:rPr>
@@ -330,7 +330,7 @@
           <w:p>
             <w:pPr>
               <w:spacing w:before="0" w:after="0" w:line="240" w:lineRule="auto"/>
-              <w:jc w:val="left"/>
+              <w:jc w:val="both"/>
             </w:pPr>
             <w:r>
               <w:rPr>
@@ -358,7 +358,7 @@
           <w:p>
             <w:pPr>
               <w:spacing w:before="0" w:after="0" w:line="240" w:lineRule="auto"/>
-              <w:jc w:val="left"/>
+              <w:jc w:val="both"/>
             </w:pPr>
             <w:r>
               <w:rPr>
@@ -388,7 +388,7 @@
           <w:p>
             <w:pPr>
               <w:spacing w:before="0" w:after="0" w:line="240" w:lineRule="auto"/>
-              <w:jc w:val="left"/>
+              <w:jc w:val="both"/>
             </w:pPr>
             <w:r>
               <w:rPr>
@@ -416,7 +416,7 @@
           <w:p>
             <w:pPr>
               <w:spacing w:before="0" w:after="0" w:line="240" w:lineRule="auto"/>
-              <w:jc w:val="left"/>
+              <w:jc w:val="both"/>
             </w:pPr>
             <w:r>
               <w:rPr>
@@ -444,7 +444,7 @@
           <w:p>
             <w:pPr>
               <w:spacing w:before="0" w:after="0" w:line="240" w:lineRule="auto"/>
-              <w:jc w:val="left"/>
+              <w:jc w:val="both"/>
             </w:pPr>
             <w:r>
               <w:rPr>
@@ -474,7 +474,7 @@
           <w:p>
             <w:pPr>
               <w:spacing w:before="0" w:after="0" w:line="240" w:lineRule="auto"/>
-              <w:jc w:val="left"/>
+              <w:jc w:val="both"/>
             </w:pPr>
             <w:r>
               <w:rPr>
@@ -502,7 +502,7 @@
           <w:p>
             <w:pPr>
               <w:spacing w:before="0" w:after="0" w:line="240" w:lineRule="auto"/>
-              <w:jc w:val="left"/>
+              <w:jc w:val="both"/>
             </w:pPr>
             <w:r>
               <w:rPr>
@@ -530,7 +530,7 @@
           <w:p>
             <w:pPr>
               <w:spacing w:before="0" w:after="0" w:line="240" w:lineRule="auto"/>
-              <w:jc w:val="left"/>
+              <w:jc w:val="both"/>
             </w:pPr>
             <w:r>
               <w:rPr>
@@ -560,7 +560,7 @@
           <w:p>
             <w:pPr>
               <w:spacing w:before="0" w:after="0" w:line="240" w:lineRule="auto"/>
-              <w:jc w:val="left"/>
+              <w:jc w:val="both"/>
             </w:pPr>
             <w:r>
               <w:rPr>
@@ -588,7 +588,7 @@
           <w:p>
             <w:pPr>
               <w:spacing w:before="0" w:after="0" w:line="240" w:lineRule="auto"/>
-              <w:jc w:val="left"/>
+              <w:jc w:val="both"/>
             </w:pPr>
             <w:r>
               <w:rPr>
@@ -616,7 +616,7 @@
           <w:p>
             <w:pPr>
               <w:spacing w:before="0" w:after="0" w:line="240" w:lineRule="auto"/>
-              <w:jc w:val="left"/>
+              <w:jc w:val="both"/>
             </w:pPr>
             <w:r>
               <w:rPr>
@@ -679,17 +679,7 @@
           <w:i w:val="0"/>
           <w:sz w:val="20"/>
         </w:rPr>
-        <w:t xml:space="preserve">La Carrera de Auditoría fue fundada el 25 de agosto de 1970 e inició sus actividades académicas en la gestión 1971, como unidad dependiente de la Facultad de Ciencias Económicas y Financieras de la Universidad Mayor de San Andrés. </w:t>
-      </w:r>
-      <w:r>
-        <w:rPr>
-          <w:rFonts w:ascii="Century Gothic" w:hAnsi="Century Gothic" w:cs="Century Gothic" w:eastAsia="Century Gothic"/>
-          <w:b w:val="0"/>
-          <w:i w:val="0"/>
-          <w:sz w:val="20"/>
-          <w:highlight w:val="green"/>
-        </w:rPr>
-        <w:t>Su creación tiene origen en el Congreso Interno de la Facultad realizado en 1970, en el contexto de la Revolución Universitaria de abril de ese año.</w:t>
+        <w:t>La Carrera de Auditoría fue fundada el 25 de agosto de 1970 e inició sus actividades académicas en la gestión 1971, como unidad dependiente de la Facultad de Ciencias Económicas y Financieras de la Universidad Mayor de San Andrés.</w:t>
       </w:r>
     </w:p>
     <w:p>
@@ -872,7 +862,7 @@
           <w:p>
             <w:pPr>
               <w:spacing w:before="0" w:after="0" w:line="240" w:lineRule="auto"/>
-              <w:jc w:val="left"/>
+              <w:jc w:val="both"/>
             </w:pPr>
             <w:r>
               <w:rPr>
@@ -900,7 +890,7 @@
           <w:p>
             <w:pPr>
               <w:spacing w:before="0" w:after="0" w:line="240" w:lineRule="auto"/>
-              <w:jc w:val="left"/>
+              <w:jc w:val="both"/>
             </w:pPr>
             <w:r>
               <w:rPr>
@@ -928,7 +918,7 @@
           <w:p>
             <w:pPr>
               <w:spacing w:before="0" w:after="0" w:line="240" w:lineRule="auto"/>
-              <w:jc w:val="left"/>
+              <w:jc w:val="both"/>
             </w:pPr>
             <w:r>
               <w:rPr>
@@ -958,7 +948,7 @@
           <w:p>
             <w:pPr>
               <w:spacing w:before="0" w:after="0" w:line="240" w:lineRule="auto"/>
-              <w:jc w:val="left"/>
+              <w:jc w:val="both"/>
             </w:pPr>
             <w:r>
               <w:rPr>
@@ -986,7 +976,7 @@
           <w:p>
             <w:pPr>
               <w:spacing w:before="0" w:after="0" w:line="240" w:lineRule="auto"/>
-              <w:jc w:val="left"/>
+              <w:jc w:val="both"/>
             </w:pPr>
             <w:r>
               <w:rPr>
@@ -1014,7 +1004,7 @@
           <w:p>
             <w:pPr>
               <w:spacing w:before="0" w:after="0" w:line="240" w:lineRule="auto"/>
-              <w:jc w:val="left"/>
+              <w:jc w:val="both"/>
             </w:pPr>
             <w:r>
               <w:rPr>
@@ -1044,7 +1034,7 @@
           <w:p>
             <w:pPr>
               <w:spacing w:before="0" w:after="0" w:line="240" w:lineRule="auto"/>
-              <w:jc w:val="left"/>
+              <w:jc w:val="both"/>
             </w:pPr>
             <w:r>
               <w:rPr>
@@ -1072,7 +1062,7 @@
           <w:p>
             <w:pPr>
               <w:spacing w:before="0" w:after="0" w:line="240" w:lineRule="auto"/>
-              <w:jc w:val="left"/>
+              <w:jc w:val="both"/>
             </w:pPr>
             <w:r>
               <w:rPr>
@@ -1080,9 +1070,8 @@
                 <w:b w:val="0"/>
                 <w:i w:val="0"/>
                 <w:sz w:val="20"/>
-                <w:highlight w:val="green"/>
               </w:rPr>
-              <w:t>Resolución HCU N.º 233/2024</w:t>
+              <w:t>Resolución HCU N.º 233/2024 (*)</w:t>
             </w:r>
           </w:p>
         </w:tc>
@@ -1101,7 +1090,7 @@
           <w:p>
             <w:pPr>
               <w:spacing w:before="0" w:after="0" w:line="240" w:lineRule="auto"/>
-              <w:jc w:val="left"/>
+              <w:jc w:val="both"/>
             </w:pPr>
             <w:r>
               <w:rPr>
@@ -1109,9 +1098,8 @@
                 <w:b w:val="0"/>
                 <w:i w:val="0"/>
                 <w:sz w:val="20"/>
-                <w:highlight w:val="green"/>
               </w:rPr>
-              <w:t>Por confirmar</w:t>
+              <w:t>24 de abril de 2024</w:t>
             </w:r>
           </w:p>
         </w:tc>
@@ -1122,6 +1110,21 @@
         <w:spacing w:before="0" w:after="120" w:line="240" w:lineRule="auto"/>
         <w:jc w:val="left"/>
       </w:pPr>
+    </w:p>
+    <w:p>
+      <w:pPr>
+        <w:spacing w:before="0" w:after="200" w:line="240" w:lineRule="auto"/>
+        <w:jc w:val="both"/>
+      </w:pPr>
+      <w:r>
+        <w:rPr>
+          <w:rFonts w:ascii="Century Gothic" w:hAnsi="Century Gothic" w:cs="Century Gothic" w:eastAsia="Century Gothic"/>
+          <w:b w:val="0"/>
+          <w:i w:val="0"/>
+          <w:sz w:val="20"/>
+        </w:rPr>
+        <w:t>(*) Abrogada por extemporaneidad de su aprobación, mediante Resolución HCU N.º 016/2025, de 29 de enero de 2025.</w:t>
+      </w:r>
     </w:p>
     <w:p>
       <w:pPr>
@@ -1255,7 +1258,7 @@
           <w:i w:val="0"/>
           <w:sz w:val="20"/>
         </w:rPr>
-        <w:t>Al concluir el segundo año de formación académica, el estudiante puede acceder además al grado de Técnico Universitario Medio, con la denominación de Auxiliar en Contabilidad General. La Resolución del Honorable Consejo Universitario N.º 426/2024, de 24 de julio de 2024, incluye este grado en el Cuadro General de Grados de la UMSA y establece como requisito ineludible la aprobación de todas las materias de primero y segundo año en el tiempo determinado de dos años; su modalidad de graduación es directa.</w:t>
+        <w:t>Al concluir el segundo año de formación académica, el estudiante puede acceder además al grado de Técnico Universitario Medio, con la denominación de Auxiliar en Contabilidad General. La Resolución del Honorable Consejo Universitario N.º 426/2024, de 24 de julio de 2024, incluye este grado en el Cuadro General de Grados de la UMSA y establece que el requisito ineludible para la extensión del Diploma Académico y del Título Profesional de Técnico Universitario Medio es la aprobación de todas las materias de primer y segundo año en el tiempo determinado (dos años continuos bajo modalidad anual), inexcusablemente. Su modalidad de graduación es directa.</w:t>
       </w:r>
     </w:p>
     <w:p>
@@ -1270,7 +1273,7 @@
           <w:i w:val="0"/>
           <w:sz w:val="20"/>
         </w:rPr>
-        <w:t>Ambos grados se encuentran tipificados en el Artículo 4 del Reglamento General de Títulos y Grados aprobado en el XII Congreso Nacional de Universidades, y sus modalidades de graduación, en el Artículo 66 del Reglamento del Régimen Académico Estudiantil del Sistema de la Universidad Boliviana.</w:t>
+        <w:t>Ambos grados se encuentran tipificados en el Artículo 4 del Reglamento General de Títulos y Grados aprobado en el XIII Congreso Nacional de Universidades, y sus modalidades de graduación, en el Artículo 66 del Reglamento del Régimen Académico Estudiantil del Sistema de la Universidad Boliviana.</w:t>
       </w:r>
     </w:p>
     <w:tbl>
@@ -1372,7 +1375,7 @@
                 <w:color w:val="FFFFFF"/>
                 <w:sz w:val="20"/>
               </w:rPr>
-              <w:t>Título</w:t>
+              <w:t>Título en Provisión Nacional</w:t>
             </w:r>
           </w:p>
         </w:tc>
@@ -1393,7 +1396,7 @@
           <w:p>
             <w:pPr>
               <w:spacing w:before="0" w:after="0" w:line="240" w:lineRule="auto"/>
-              <w:jc w:val="left"/>
+              <w:jc w:val="both"/>
             </w:pPr>
             <w:r>
               <w:rPr>
@@ -1421,7 +1424,7 @@
           <w:p>
             <w:pPr>
               <w:spacing w:before="0" w:after="0" w:line="240" w:lineRule="auto"/>
-              <w:jc w:val="left"/>
+              <w:jc w:val="both"/>
             </w:pPr>
             <w:r>
               <w:rPr>
@@ -1449,7 +1452,7 @@
           <w:p>
             <w:pPr>
               <w:spacing w:before="0" w:after="0" w:line="240" w:lineRule="auto"/>
-              <w:jc w:val="left"/>
+              <w:jc w:val="both"/>
             </w:pPr>
             <w:r>
               <w:rPr>
@@ -1458,7 +1461,7 @@
                 <w:i w:val="0"/>
                 <w:sz w:val="20"/>
               </w:rPr>
-              <w:t>Título profesional de Técnico Universitario Medio</w:t>
+              <w:t>Auxiliar en Contabilidad General</w:t>
             </w:r>
           </w:p>
         </w:tc>
@@ -1479,7 +1482,7 @@
           <w:p>
             <w:pPr>
               <w:spacing w:before="0" w:after="0" w:line="240" w:lineRule="auto"/>
-              <w:jc w:val="left"/>
+              <w:jc w:val="both"/>
             </w:pPr>
             <w:r>
               <w:rPr>
@@ -1507,7 +1510,7 @@
           <w:p>
             <w:pPr>
               <w:spacing w:before="0" w:after="0" w:line="240" w:lineRule="auto"/>
-              <w:jc w:val="left"/>
+              <w:jc w:val="both"/>
             </w:pPr>
             <w:r>
               <w:rPr>
@@ -1535,7 +1538,7 @@
           <w:p>
             <w:pPr>
               <w:spacing w:before="0" w:after="0" w:line="240" w:lineRule="auto"/>
-              <w:jc w:val="left"/>
+              <w:jc w:val="both"/>
             </w:pPr>
             <w:r>
               <w:rPr>
@@ -1544,7 +1547,7 @@
                 <w:i w:val="0"/>
                 <w:sz w:val="20"/>
               </w:rPr>
-              <w:t>Título en provisión nacional de Contador General</w:t>
+              <w:t>Contador General</w:t>
             </w:r>
           </w:p>
         </w:tc>
@@ -1565,7 +1568,7 @@
           <w:p>
             <w:pPr>
               <w:spacing w:before="0" w:after="0" w:line="240" w:lineRule="auto"/>
-              <w:jc w:val="left"/>
+              <w:jc w:val="both"/>
             </w:pPr>
             <w:r>
               <w:rPr>
@@ -1593,7 +1596,7 @@
           <w:p>
             <w:pPr>
               <w:spacing w:before="0" w:after="0" w:line="240" w:lineRule="auto"/>
-              <w:jc w:val="left"/>
+              <w:jc w:val="both"/>
             </w:pPr>
             <w:r>
               <w:rPr>
@@ -1621,7 +1624,7 @@
           <w:p>
             <w:pPr>
               <w:spacing w:before="0" w:after="0" w:line="240" w:lineRule="auto"/>
-              <w:jc w:val="left"/>
+              <w:jc w:val="both"/>
             </w:pPr>
             <w:r>
               <w:rPr>
@@ -1630,7 +1633,7 @@
                 <w:i w:val="0"/>
                 <w:sz w:val="20"/>
               </w:rPr>
-              <w:t>Título en provisión nacional de Contador Público Autorizado</w:t>
+              <w:t>Contador Público Autorizado</w:t>
             </w:r>
           </w:p>
         </w:tc>
@@ -1688,7 +1691,7 @@
           <w:i w:val="0"/>
           <w:sz w:val="20"/>
         </w:rPr>
-        <w:t>Sede central:</w:t>
+        <w:t>Sede Central:</w:t>
       </w:r>
       <w:r>
         <w:rPr>
@@ -1725,7 +1728,7 @@
           <w:i w:val="0"/>
           <w:sz w:val="20"/>
         </w:rPr>
-        <w:t xml:space="preserve"> Centro Regional Universitario Yungas, en Chulumani, y Sede Universitaria Local Caranavi. En la gestión 2025 estas sedes registraron 104 estudiantes inscritos.</w:t>
+        <w:t xml:space="preserve"> En la actualidad la carrera desarrolla actividades en el Centro Regional Universitario en Chulumani, y Sede Universitaria Local Caranavi.</w:t>
       </w:r>
     </w:p>
     <w:p>
@@ -1815,7 +1818,7 @@
           <w:i w:val="0"/>
           <w:sz w:val="20"/>
         </w:rPr>
-        <w:t>Técnico Universitario Medio, conforme a la Resolución del Honorable Consejo Universitario N.º 426/2024.</w:t>
+        <w:t>Técnico Universitario Superior en Contabilidad General, conforme a la Resolución del Honorable Consejo Universitario N.º 290/2016.</w:t>
       </w:r>
     </w:p>
     <w:p>
@@ -1830,7 +1833,7 @@
           <w:i w:val="0"/>
           <w:sz w:val="20"/>
         </w:rPr>
-        <w:t>Técnico Universitario Superior en Contabilidad General, conforme a la Resolución del Honorable Consejo Universitario N.º 290/2016.</w:t>
+        <w:t>Técnico Universitario Medio, Auxiliar en Contabilidad General, conforme a la Resolución del Honorable Consejo Universitario N.º 426/2024.</w:t>
       </w:r>
     </w:p>
     <w:p>
@@ -1920,7 +1923,7 @@
           <w:i w:val="0"/>
           <w:sz w:val="20"/>
         </w:rPr>
-        <w:t>Título profesional de Técnico Universitario Medio, conforme al Artículo Segundo de la Resolución del Honorable Consejo Universitario N.º 426/2024.</w:t>
+        <w:t>Título en provisión nacional de Contador General, conforme a la Resolución del Honorable Consejo Universitario N.º 290/2016.</w:t>
       </w:r>
     </w:p>
     <w:p>
@@ -1935,7 +1938,7 @@
           <w:i w:val="0"/>
           <w:sz w:val="20"/>
         </w:rPr>
-        <w:t>Título en provisión nacional de Contador General, conforme a la Resolución del Honorable Consejo Universitario N.º 290/2016.</w:t>
+        <w:t>Técnico Universitario Medio, Auxiliar en Contabilidad General, conforme a la Resolución del Honorable Consejo Universitario N.º 426/2024.</w:t>
       </w:r>
     </w:p>
     <w:p>
@@ -2150,7 +2153,7 @@
           <w:i w:val="0"/>
           <w:sz w:val="20"/>
         </w:rPr>
-        <w:t xml:space="preserve"> una vez aprobado en las instancias de cogobierno, el plan de estudios rediseñado se aplicará en la gestión siguiente, conforme al Artículo 16 del Reglamento de Innovación Curricular.</w:t>
+        <w:t xml:space="preserve"> una vez aprobado en las instancias de cogobierno, el plan de estudios rediseñado se aplicará conforme al Artículo 16 del Reglamento de Innovación Curricular.</w:t>
       </w:r>
     </w:p>
     <w:sectPr>

</xml_diff>